<commit_message>
fix(cr): correct Table V country labels and page citation in CR Artikel 7
- Thornhill & White (2007) and Walsh et al. (2008) moved from Yunani to
  Kanada, matching Table V p.94 of Salavou (2015)
- Page citation for 'global challenge' quote corrected hlm. 95 → hlm. 96,
  matching its actual location in the Closing Remarks section

Co-Authored-By: Claude Sonnet 4.6 <noreply@anthropic.com>
</commit_message>
<xml_diff>
--- a/Critical Thinking of the Article/01079_Dzaki Muhammad Yusfian_Artikel 7.docx
+++ b/Critical Thinking of the Article/01079_Dzaki Muhammad Yusfian_Artikel 7.docx
@@ -217,7 +217,7 @@
         <w:jc w:val="both"/>
       </w:pPr>
       <w:r>
-        <w:t>Pergeseran ketiga, meskipun tidak dieksplisitkan dalam artikel Salavou seintens dua pergeseran sebelumnya, dapat direkonstruksi dari pernyataannya tentang perubahan lingkungan kompetisi pasca-2000. Pada Bab Diskusi (Salavou 2015, hlm. 95) ia mengakui bahwa "the global challenge of today is how scholars will revise theory to better capture reality." Pengakuan implisit ini sebenarnya membuka pintu pada literatur coopetition (Brandenburger &amp; Nalebuff 1996) yang memperluas Five Forces dengan dimensi complementor, dan literatur platform economics yang menempatkan kompetisi dan kerjasama sebagai dimensi yang berjalan simultan.</w:t>
+        <w:t>Pergeseran ketiga, meskipun tidak dieksplisitkan dalam artikel Salavou seintens dua pergeseran sebelumnya, dapat direkonstruksi dari pernyataannya tentang perubahan lingkungan kompetisi pasca-2000. Pada Bab Diskusi (Salavou 2015, hlm. 96) ia mengakui bahwa "the global challenge of today is how scholars will revise theory to better capture reality." Pengakuan implisit ini sebenarnya membuka pintu pada literatur coopetition (Brandenburger &amp; Nalebuff 1996) yang memperluas Five Forces dengan dimensi complementor, dan literatur platform economics yang menempatkan kompetisi dan kerjasama sebagai dimensi yang berjalan simultan.</w:t>
       </w:r>
     </w:p>
     <w:p>
@@ -261,7 +261,7 @@
         <w:jc w:val="both"/>
       </w:pPr>
       <w:r>
-        <w:t>Tabel V (Salavou 2015, hlm. 91–94) merangkum 15 studi empiris tentang strategi hybrid dari tahun 2000 ke depan. Studi-studi ini mencakup konteks Ghana (Acquaah &amp; Yasai-Ardekani 2008), Amerika Serikat (Beal 2000), lintas-negara (Campbell-Hunt 2000), Spanyol (Claver-Cortés et al. 2012), India (Gopalakrishna &amp; Subramanian 2001), Korea (Kim et al. 2004), Austria (Leitner &amp; Guldenberg 2010), China (Li &amp; Li 2008), Spanyol (Pertusa-Ortega et al. 2009), dan Yunani (Salavou &amp; Halikias 2009; Salavou 2010; Salavou 2013; Spanos et al. 2004; Thornhill &amp; White 2007; Walsh et al. 2008). Metodologi yang digunakan beragam: regression analysis, cluster analysis, meta-analysis logistic regression, dan ANOVA. Ukuran kinerja juga heterogen: ROA, ROE, profit margin, sales growth, dan ukuran subjektif berbasis persepsi manajer. Temuan dominan: strategi hybrid secara konsisten menghasilkan kinerja yang lebih tinggi dibandingkan strategi murni di berbagai konteks industri. Tidak ada satu pun studi dalam Tabel V yang berasal dari Asia Tenggara, sehingga generalisabilitas ke konteks Indonesia harus dipertimbangkan secara kritis.</w:t>
+        <w:t>Tabel V (Salavou 2015, hlm. 91–94) merangkum 15 studi empiris tentang strategi hybrid dari tahun 2000 ke depan. Studi-studi ini mencakup konteks Ghana (Acquaah &amp; Yasai-Ardekani 2008), Amerika Serikat (Beal 2000), lintas-negara (Campbell-Hunt 2000), Spanyol (Claver-Cortés et al. 2012), India (Gopalakrishna &amp; Subramanian 2001), Korea (Kim et al. 2004), Austria (Leitner &amp; Guldenberg 2010), China (Li &amp; Li 2008), Spanyol (Pertusa-Ortega et al. 2009), dan Yunani (Salavou &amp; Halikias 2009; Salavou 2010; Salavou 2013; Spanos et al. 2004), dan Kanada (Thornhill &amp; White 2007; Walsh et al. 2008). Metodologi yang digunakan beragam: regression analysis, cluster analysis, meta-analysis logistic regression, dan ANOVA. Ukuran kinerja juga heterogen: ROA, ROE, profit margin, sales growth, dan ukuran subjektif berbasis persepsi manajer. Temuan dominan: strategi hybrid secara konsisten menghasilkan kinerja yang lebih tinggi dibandingkan strategi murni di berbagai konteks industri. Tidak ada satu pun studi dalam Tabel V yang berasal dari Asia Tenggara, sehingga generalisabilitas ke konteks Indonesia harus dipertimbangkan secara kritis.</w:t>
       </w:r>
     </w:p>
     <w:p>

</xml_diff>